<commit_message>
Lab3 - problem 4
Lab3 - problem 4
</commit_message>
<xml_diff>
--- a/Assigment/Lab 3/Lab3_Phuong Nguyen.docx
+++ b/Assigment/Lab 3/Lab3_Phuong Nguyen.docx
@@ -2226,26 +2226,6 @@
         </w:rPr>
         <w:br w:type="page"/>
       </w:r>
-      <w:r>
-        <w:rPr>
-          <w:b/>
-          <w:bCs/>
-          <w:sz w:val="22"/>
-          <w:szCs w:val="22"/>
-          <w:lang w:val="en-US"/>
-        </w:rPr>
-        <w:lastRenderedPageBreak/>
-        <w:t>Source code:</w:t>
-      </w:r>
-    </w:p>
-    <w:p>
-      <w:pPr>
-        <w:rPr>
-          <w:sz w:val="22"/>
-          <w:szCs w:val="22"/>
-          <w:lang w:val="en-US"/>
-        </w:rPr>
-      </w:pPr>
     </w:p>
     <w:p>
       <w:pPr>
@@ -2266,6 +2246,7 @@
           <w:szCs w:val="22"/>
           <w:lang w:val="en-US"/>
         </w:rPr>
+        <w:lastRenderedPageBreak/>
         <w:t xml:space="preserve">Problem </w:t>
       </w:r>
       <w:r>

</xml_diff>

<commit_message>
Lab3 - assignment document
Lab3 - assignment document
</commit_message>
<xml_diff>
--- a/Assigment/Lab 3/Lab3_Phuong Nguyen.docx
+++ b/Assigment/Lab 3/Lab3_Phuong Nguyen.docx
@@ -2235,6 +2235,8 @@
           <w:numId w:val="2"/>
         </w:numPr>
         <w:rPr>
+          <w:b/>
+          <w:bCs/>
           <w:sz w:val="22"/>
           <w:szCs w:val="22"/>
           <w:lang w:val="vi-VN"/>
@@ -2242,6 +2244,8 @@
       </w:pPr>
       <w:r>
         <w:rPr>
+          <w:b/>
+          <w:bCs/>
           <w:sz w:val="22"/>
           <w:szCs w:val="22"/>
           <w:lang w:val="en-US"/>
@@ -2251,6 +2255,8 @@
       </w:r>
       <w:r>
         <w:rPr>
+          <w:b/>
+          <w:bCs/>
           <w:sz w:val="22"/>
           <w:szCs w:val="22"/>
           <w:lang w:val="en-US"/>
@@ -2258,10 +2264,149 @@
         <w:t>4:</w:t>
       </w:r>
     </w:p>
+    <w:p>
+      <w:pPr>
+        <w:pStyle w:val="ListParagraph"/>
+        <w:numPr>
+          <w:ilvl w:val="1"/>
+          <w:numId w:val="2"/>
+        </w:numPr>
+        <w:rPr>
+          <w:sz w:val="22"/>
+          <w:szCs w:val="22"/>
+          <w:lang w:val="vi-VN"/>
+        </w:rPr>
+      </w:pPr>
+      <w:r>
+        <w:rPr>
+          <w:sz w:val="22"/>
+          <w:szCs w:val="22"/>
+          <w:lang w:val="en-US"/>
+        </w:rPr>
+        <w:t>Class diagram</w:t>
+      </w:r>
+      <w:r>
+        <w:rPr>
+          <w:sz w:val="22"/>
+          <w:szCs w:val="22"/>
+          <w:lang w:val="en-US"/>
+        </w:rPr>
+        <w:t>:</w:t>
+      </w:r>
+    </w:p>
+    <w:p>
+      <w:pPr>
+        <w:rPr>
+          <w:sz w:val="22"/>
+          <w:szCs w:val="22"/>
+          <w:lang w:val="en-US"/>
+        </w:rPr>
+      </w:pPr>
+      <w:r>
+        <w:rPr>
+          <w:sz w:val="22"/>
+          <w:szCs w:val="22"/>
+          <w:lang w:val="en-US"/>
+        </w:rPr>
+        <w:drawing>
+          <wp:inline distT="0" distB="0" distL="0" distR="0" wp14:anchorId="1A55D3A0" wp14:editId="0E23B126">
+            <wp:extent cx="5943600" cy="3772535"/>
+            <wp:effectExtent l="0" t="0" r="0" b="0"/>
+            <wp:docPr id="1879404680" name="Picture 1"/>
+            <wp:cNvGraphicFramePr>
+              <a:graphicFrameLocks xmlns:a="http://schemas.openxmlformats.org/drawingml/2006/main" noChangeAspect="1"/>
+            </wp:cNvGraphicFramePr>
+            <a:graphic xmlns:a="http://schemas.openxmlformats.org/drawingml/2006/main">
+              <a:graphicData uri="http://schemas.openxmlformats.org/drawingml/2006/picture">
+                <pic:pic xmlns:pic="http://schemas.openxmlformats.org/drawingml/2006/picture">
+                  <pic:nvPicPr>
+                    <pic:cNvPr id="1879404680" name=""/>
+                    <pic:cNvPicPr/>
+                  </pic:nvPicPr>
+                  <pic:blipFill>
+                    <a:blip r:embed="rId14"/>
+                    <a:stretch>
+                      <a:fillRect/>
+                    </a:stretch>
+                  </pic:blipFill>
+                  <pic:spPr>
+                    <a:xfrm>
+                      <a:off x="0" y="0"/>
+                      <a:ext cx="5943600" cy="3772535"/>
+                    </a:xfrm>
+                    <a:prstGeom prst="rect">
+                      <a:avLst/>
+                    </a:prstGeom>
+                  </pic:spPr>
+                </pic:pic>
+              </a:graphicData>
+            </a:graphic>
+          </wp:inline>
+        </w:drawing>
+      </w:r>
+    </w:p>
+    <w:p>
+      <w:pPr>
+        <w:pStyle w:val="ListParagraph"/>
+        <w:numPr>
+          <w:ilvl w:val="1"/>
+          <w:numId w:val="2"/>
+        </w:numPr>
+        <w:rPr>
+          <w:sz w:val="22"/>
+          <w:szCs w:val="22"/>
+          <w:lang w:val="vi-VN"/>
+        </w:rPr>
+      </w:pPr>
+      <w:r>
+        <w:rPr>
+          <w:sz w:val="22"/>
+          <w:szCs w:val="22"/>
+          <w:lang w:val="en-US"/>
+        </w:rPr>
+        <w:t>Source code:</w:t>
+      </w:r>
+      <w:r>
+        <w:rPr>
+          <w:sz w:val="22"/>
+          <w:szCs w:val="22"/>
+          <w:lang w:val="en-US"/>
+        </w:rPr>
+        <w:t xml:space="preserve"> </w:t>
+      </w:r>
+      <w:hyperlink r:id="rId15" w:history="1">
+        <w:r>
+          <w:rPr>
+            <w:rStyle w:val="Hyperlink"/>
+            <w:sz w:val="22"/>
+            <w:szCs w:val="22"/>
+            <w:lang w:val="en-US"/>
+          </w:rPr>
+          <w:t>https://github.com/miunthphuong/MPP/tree/main/Assigment/Lab%203/Lab3%20-%20code/code%20for%20prob4</w:t>
+        </w:r>
+      </w:hyperlink>
+      <w:r>
+        <w:rPr>
+          <w:sz w:val="22"/>
+          <w:szCs w:val="22"/>
+          <w:lang w:val="en-US"/>
+        </w:rPr>
+        <w:t xml:space="preserve"> </w:t>
+      </w:r>
+    </w:p>
+    <w:p>
+      <w:pPr>
+        <w:rPr>
+          <w:sz w:val="22"/>
+          <w:szCs w:val="22"/>
+          <w:lang w:val="en-US"/>
+        </w:rPr>
+      </w:pPr>
+    </w:p>
     <w:sectPr>
-      <w:headerReference w:type="default" r:id="rId14"/>
-      <w:footerReference w:type="even" r:id="rId15"/>
-      <w:footerReference w:type="default" r:id="rId16"/>
+      <w:headerReference w:type="default" r:id="rId16"/>
+      <w:footerReference w:type="even" r:id="rId17"/>
+      <w:footerReference w:type="default" r:id="rId18"/>
       <w:pgSz w:w="12240" w:h="15840"/>
       <w:pgMar w:top="1440" w:right="1440" w:bottom="1440" w:left="1440" w:header="708" w:footer="708" w:gutter="0"/>
       <w:cols w:space="708"/>

</xml_diff>